<commit_message>
squash V1.0 SQL migrations into productization bundle
</commit_message>
<xml_diff>
--- a/docs/version/v0/OpsPilot_技术与开发方案_V2.docx
+++ b/docs/version/v0/OpsPilot_技术与开发方案_V2.docx
@@ -2,6 +2,95 @@
 <file path=word/document.xml><?xml version="1.0" encoding="utf-8"?>
 <w:document xmlns:wpc="http://schemas.microsoft.com/office/word/2010/wordprocessingCanvas" xmlns:mo="http://schemas.microsoft.com/office/mac/office/2008/main" xmlns:mc="http://schemas.openxmlformats.org/markup-compatibility/2006" xmlns:mv="urn:schemas-microsoft-com:mac:vml" xmlns:o="urn:schemas-microsoft-com:office:office" xmlns:r="http://schemas.openxmlformats.org/officeDocument/2006/relationships" xmlns:m="http://schemas.openxmlformats.org/officeDocument/2006/math" xmlns:v="urn:schemas-microsoft-com:vml" xmlns:wp14="http://schemas.microsoft.com/office/word/2010/wordprocessingDrawing" xmlns:wp="http://schemas.openxmlformats.org/drawingml/2006/wordprocessingDrawing" xmlns:w10="urn:schemas-microsoft-com:office:word" xmlns:w="http://schemas.openxmlformats.org/wordprocessingml/2006/main" xmlns:w14="http://schemas.microsoft.com/office/word/2010/wordml" xmlns:wpg="http://schemas.microsoft.com/office/word/2010/wordprocessingGroup" xmlns:wpi="http://schemas.microsoft.com/office/word/2010/wordprocessingInk" xmlns:wne="http://schemas.microsoft.com/office/word/2006/wordml" xmlns:wps="http://schemas.microsoft.com/office/word/2010/wordprocessingShape" mc:Ignorable="w14 wp14">
   <w:body>
+    <w:p>
+      <w:pPr>
+        <w:pStyle w:val="Heading1"/>
+      </w:pPr>
+      <w:r>
+        <w:rPr>
+          <w:rFonts w:ascii="Microsoft YaHei" w:hAnsi="Microsoft YaHei" w:eastAsia="Microsoft YaHei" w:cs="Microsoft YaHei"/>
+          <w:b w:val="0"/>
+          <w:sz w:val="28"/>
+        </w:rPr>
+        <w:t>V1.0 版本迭代记录（2026-05-09）</w:t>
+      </w:r>
+    </w:p>
+    <w:p>
+      <w:pPr/>
+      <w:r>
+        <w:rPr>
+          <w:rFonts w:ascii="Microsoft YaHei" w:hAnsi="Microsoft YaHei" w:eastAsia="Microsoft YaHei" w:cs="Microsoft YaHei"/>
+          <w:b w:val="0"/>
+          <w:sz w:val="22"/>
+        </w:rPr>
+        <w:t>本次更迭围绕 V1.0 数据库迁移链路收口，目标是减少默认 SQL 文件数量，同时保持初始化、回滚和历史追溯能力。</w:t>
+      </w:r>
+    </w:p>
+    <w:p>
+      <w:pPr>
+        <w:pStyle w:val="ListBullet"/>
+      </w:pPr>
+      <w:r>
+        <w:rPr>
+          <w:rFonts w:ascii="Microsoft YaHei" w:hAnsi="Microsoft YaHei" w:eastAsia="Microsoft YaHei" w:cs="Microsoft YaHei"/>
+          <w:sz w:val="22"/>
+        </w:rPr>
+        <w:t>根目录迁移由原 000005-000015 合并为 000005_v10_productization_bundle.up.sql / .down.sql。</w:t>
+      </w:r>
+    </w:p>
+    <w:p>
+      <w:pPr>
+        <w:pStyle w:val="ListBullet"/>
+      </w:pPr>
+      <w:r>
+        <w:rPr>
+          <w:rFonts w:ascii="Microsoft YaHei" w:hAnsi="Microsoft YaHei" w:eastAsia="Microsoft YaHei" w:cs="Microsoft YaHei"/>
+          <w:sz w:val="22"/>
+        </w:rPr>
+        <w:t>原始 V1.0 细粒度增量迁移已归档到 server/migrations/archive/v1.0-incremental/，保留历史核对路径。</w:t>
+      </w:r>
+    </w:p>
+    <w:p>
+      <w:pPr>
+        <w:pStyle w:val="ListBullet"/>
+      </w:pPr>
+      <w:r>
+        <w:rPr>
+          <w:rFonts w:ascii="Microsoft YaHei" w:hAnsi="Microsoft YaHei" w:eastAsia="Microsoft YaHei" w:cs="Microsoft YaHei"/>
+          <w:sz w:val="22"/>
+        </w:rPr>
+        <w:t>已在本机 MySQL 8.0 上完成实际执行、bundle 回滚，以及与旧迁移链路的 schema 等价验证。</w:t>
+      </w:r>
+    </w:p>
+    <w:p>
+      <w:pPr>
+        <w:pStyle w:val="ListBullet"/>
+      </w:pPr>
+      <w:r>
+        <w:rPr>
+          <w:rFonts w:ascii="Microsoft YaHei" w:hAnsi="Microsoft YaHei" w:eastAsia="Microsoft YaHei" w:cs="Microsoft YaHei"/>
+          <w:sz w:val="22"/>
+        </w:rPr>
+        <w:t>根目录 VERSION 已同步收口到 1.0.0-dev，README、CHANGELOG、V1.0 设计/验收记录和 UML 说明已同步更新。</w:t>
+      </w:r>
+    </w:p>
+    <w:p>
+      <w:pPr/>
+      <w:r>
+        <w:rPr>
+          <w:rFonts w:ascii="Microsoft YaHei" w:hAnsi="Microsoft YaHei" w:eastAsia="Microsoft YaHei" w:cs="Microsoft YaHei"/>
+          <w:b w:val="0"/>
+          <w:sz w:val="22"/>
+        </w:rPr>
+        <w:t>验证结论：当前根目录 000001-000005 可直接用于新环境初始化；历史 000005-000015 继续作为归档资料保留。</w:t>
+      </w:r>
+    </w:p>
+    <w:p>
+      <w:pPr/>
+      <w:r>
+        <w:br w:type="page"/>
+      </w:r>
+    </w:p>
     <w:p>
       <w:pPr>
         <w:spacing w:before="1760"/>

</xml_diff>